<commit_message>
Apply 3B rebate decision and one CBAM convention everywhere: final set v1.5 documents, kernel v1.5 builder with Table2_Final
Co-Authored-By: Claude Sonnet 5.5 <noreply@anthropic.com>
Claude-Session: https://claude.ai/code/session_01MnaF19gSWzaMiztLqS74jT
</commit_message>
<xml_diff>
--- a/egypt/supporting/AdHocRebuild/ResultsComparison_Table2_v0.4.docx
+++ b/egypt/supporting/AdHocRebuild/ResultsComparison_Table2_v0.4.docx
@@ -126,7 +126,7 @@
         <w:rPr>
           <w:rFonts w:ascii="Consolas" w:hAnsi="Consolas" w:eastAsia="Consolas"/>
         </w:rPr>
-        <w:t>CPAT_Industry_Kernel_Egypt_v1.3.xlsx</w:t>
+        <w:t>CPAT_Industry_Kernel_Egypt_v1.5.xlsx</w:t>
       </w:r>
       <w:r>
         <w:t xml:space="preserve">, sheet </w:t>
@@ -167,7 +167,7 @@
         <w:rPr>
           <w:rFonts w:ascii="Consolas" w:hAnsi="Consolas" w:eastAsia="Consolas"/>
         </w:rPr>
-        <w:t>EGYPT_CarveOut_Table2_v1.3</w:t>
+        <w:t>EGYPT_CarveOut_Table2_v1.5</w:t>
       </w:r>
       <w:r>
         <w:t>), whose row O is the intensity-only measure (EGYPT_Methodology section 4.5).</w:t>
@@ -5530,7 +5530,7 @@
         <w:rPr>
           <w:rFonts w:ascii="Consolas" w:hAnsi="Consolas" w:eastAsia="Consolas"/>
         </w:rPr>
-        <w:t>EGYPT_CarveOut_Table2_v1.3</w:t>
+        <w:t>EGYPT_CarveOut_Table2_v1.5</w:t>
       </w:r>
       <w:r>
         <w:t>): original CPAT runs, with only the CBAM block replaced.</w:t>

</xml_diff>